<commit_message>
MD Y4 list amendment and code review
</commit_message>
<xml_diff>
--- a/year4/MD/data/MD_Y4_SFY27_DD.docx
+++ b/year4/MD/data/MD_Y4_SFY27_DD.docx
@@ -26,10 +26,10 @@
         <w:rPr>
           <w:b w:val="1"/>
           <w:bCs w:val="1"/>
-          <w:color w:val="00ff00"/>
-          <w:rtl w:val="0"/>
-        </w:rPr>
-        <w:t xml:space="preserve">Updated</w:t>
+          <w:color w:val="ff9900"/>
+          <w:rtl w:val="0"/>
+        </w:rPr>
+        <w:t xml:space="preserve">Updates in progress</w:t>
       </w:r>
       <w:r>
         <w:rPr>
@@ -62,7 +62,7 @@
           <w:szCs w:val="20"/>
           <w:rtl w:val="0"/>
         </w:rPr>
-        <w:t xml:space="preserve">Last updated 02/26/2026 [added No Information specifications]; DG approved 2/20/2026</w:t>
+        <w:t xml:space="preserve">Last updated 04/08/2026 [amended docs]; DG approved 2/20/2026</w:t>
       </w:r>
     </w:p>
     <w:p>
@@ -825,7 +825,7 @@
           <w:szCs w:val="20"/>
           <w:rtl w:val="0"/>
         </w:rPr>
-        <w:t xml:space="preserve">, Final, August 2025 (SFY27 Comprehensive IUP)</w:t>
+        <w:t xml:space="preserve">, Amendment, March 2, 2026 (SFY27 Comprehensive IUP)</w:t>
       </w:r>
     </w:p>
     <w:p>
@@ -858,7 +858,7 @@
           <w:szCs w:val="20"/>
           <w:rtl w:val="0"/>
         </w:rPr>
-        <w:t xml:space="preserve">, Final, Aug 15, 2025 (SFY27 Comprehensive List)</w:t>
+        <w:t xml:space="preserve">, Amendment, Feb 4, 2026 (SFY27 Comprehensive List)</w:t>
       </w:r>
     </w:p>
     <w:p>
@@ -933,7 +933,7 @@
           <w:szCs w:val="20"/>
           <w:rtl w:val="0"/>
         </w:rPr>
-        <w:t xml:space="preserve">, Final (SFY27 Fundable List)</w:t>
+        <w:t xml:space="preserve">, Amendment, March 2, 2026 (SFY27 Fundable List)</w:t>
       </w:r>
     </w:p>
     <w:p>
@@ -2712,8 +2712,11 @@
       </w:r>
       <w:r>
         <w:rPr>
-          <w:rtl w:val="0"/>
-        </w:rPr>
+          <w:sz w:val="20"/>
+          <w:szCs w:val="20"/>
+          <w:rtl w:val="0"/>
+        </w:rPr>
+        <w:t xml:space="preserve">, if applicable</w:t>
       </w:r>
     </w:p>
     <w:sectPr>

</xml_diff>